<commit_message>
docs(terminaux-paiement-en-ligne-01M52QB9): revue post-fusion et statut « mergée »
Revue post-fusion (agent distinct) : publiable avec réserves, aucun bloquant.
Constats documentaires traités : OP-N69 réduit à quatre colonnes (WP07),
ADR-121 précisé (essai compté avant vérification), spec.md FR-004 et FR-017.
spec-kitty-docs-maintain : statut « mergée » dans 01, 02, 04, 05, 06, 07,
spec-index et docs-state. Document Word de la mission régénéré ; passation.

Co-Authored-By: Claude Opus 5.5 <noreply@anthropic.com>
</commit_message>
<xml_diff>
--- a/docs/Mission-05b-Encaissement-en-ligne.docx
+++ b/docs/Mission-05b-Encaissement-en-ligne.docx
@@ -364,7 +364,7 @@
                 <w:sz w:val="19"/>
                 <w:szCs w:val="19"/>
               </w:rPr>
-              <w:t xml:space="preserve">État au 23 octobre 2026</w:t>
+              <w:t xml:space="preserve">État au 27 octobre 2026</w:t>
             </w:r>
           </w:p>
         </w:tc>
@@ -390,7 +390,7 @@
                 <w:sz w:val="19"/>
                 <w:szCs w:val="19"/>
               </w:rPr>
-              <w:t xml:space="preserve">Implémentation en cours : 6 lots sur 14 approuvés (WP01, WP02, WP03, WP04, WP06, WP08), WP05 en cours</w:t>
+              <w:t xml:space="preserve">Acceptée et mergée le 26/10/2026 sur feat/terminaux-paiement-en-ligne (squash 870bd3f4) ; revue post-fusion faite (publiable avec réserves) ; PR vers main à venir</w:t>
             </w:r>
           </w:p>
         </w:tc>
@@ -463,7 +463,7 @@
         <w:spacing w:after="120"/>
       </w:pPr>
       <w:r>
-        <w:t xml:space="preserve">État au 23 octobre 2026 : la couche base est presque terminée (vendeurs, catalogue, paiement et annulation, OP-N74 approuvés ; demandes QR en cours), ainsi que le socle applicatif et le contrat d’API. Restent les droits de la base, les routes de l’API (vendeurs, catalogue, paiement, annulation, QR) et les preuves de bout en bout.</w:t>
+        <w:t xml:space="preserve">État au 27 octobre 2026 : les 14 lots sont approuvés, la mission est acceptée et mergée sur feat/terminaux-paiement-en-ligne (26/10/2026). Rejeu sur la branche : pgTAP 39 fichiers, 2931 tests verts ; Jest 139 suites vertes hors instabilités connues du poste. Latence mesurée du paiement par bracelet : p95 ≈ 68 ms, p99 ≈ 84 ms. La revue post-fusion conclut « publiable avec réserves » (mineurs de test et de consignation, aucun bloquant). Reste la PR vers main, dont la CI confirme NFR-010.</w:t>
       </w:r>
     </w:p>
     <w:p>
@@ -2268,6 +2268,486 @@
           </w:p>
         </w:tc>
       </w:tr>
+      <w:tr>
+        <w:tc>
+          <w:tcPr>
+            <w:tcW w:w="2400" w:type="dxa"/>
+            <w:tcBorders>
+              <w:top w:val="single" w:sz="4" w:space="0" w:color="A6A6A6"/>
+              <w:left w:val="single" w:sz="4" w:space="0" w:color="A6A6A6"/>
+              <w:bottom w:val="single" w:sz="4" w:space="0" w:color="A6A6A6"/>
+              <w:right w:val="single" w:sz="4" w:space="0" w:color="A6A6A6"/>
+            </w:tcBorders>
+            <w:tcMar>
+              <w:top w:w="60" w:type="dxa"/>
+              <w:left w:w="90" w:type="dxa"/>
+              <w:bottom w:w="60" w:type="dxa"/>
+              <w:right w:w="90" w:type="dxa"/>
+            </w:tcMar>
+          </w:tcPr>
+          <w:p>
+            <w:r>
+              <w:rPr>
+                <w:sz w:val="19"/>
+                <w:szCs w:val="19"/>
+              </w:rPr>
+              <w:t xml:space="preserve">Idempotence du PIN (ADR-126)</w:t>
+            </w:r>
+          </w:p>
+        </w:tc>
+        <w:tc>
+          <w:tcPr>
+            <w:tcW w:w="3800" w:type="dxa"/>
+            <w:tcBorders>
+              <w:top w:val="single" w:sz="4" w:space="0" w:color="A6A6A6"/>
+              <w:left w:val="single" w:sz="4" w:space="0" w:color="A6A6A6"/>
+              <w:bottom w:val="single" w:sz="4" w:space="0" w:color="A6A6A6"/>
+              <w:right w:val="single" w:sz="4" w:space="0" w:color="A6A6A6"/>
+            </w:tcBorders>
+            <w:tcMar>
+              <w:top w:w="60" w:type="dxa"/>
+              <w:left w:w="90" w:type="dxa"/>
+              <w:bottom w:w="60" w:type="dxa"/>
+              <w:right w:w="90" w:type="dxa"/>
+            </w:tcMar>
+          </w:tcPr>
+          <w:p>
+            <w:r>
+              <w:rPr>
+                <w:sz w:val="19"/>
+                <w:szCs w:val="19"/>
+              </w:rPr>
+              <w:t xml:space="preserve">Le PIN n’entre dans l’empreinte que sous un dérivé argon2 ; secret distinct VENDOR_PIN_IDEMPOTENCY_SECRET</w:t>
+            </w:r>
+          </w:p>
+        </w:tc>
+        <w:tc>
+          <w:tcPr>
+            <w:tcW w:w="3438" w:type="dxa"/>
+            <w:tcBorders>
+              <w:top w:val="single" w:sz="4" w:space="0" w:color="A6A6A6"/>
+              <w:left w:val="single" w:sz="4" w:space="0" w:color="A6A6A6"/>
+              <w:bottom w:val="single" w:sz="4" w:space="0" w:color="A6A6A6"/>
+              <w:right w:val="single" w:sz="4" w:space="0" w:color="A6A6A6"/>
+            </w:tcBorders>
+            <w:tcMar>
+              <w:top w:w="60" w:type="dxa"/>
+              <w:left w:w="90" w:type="dxa"/>
+              <w:bottom w:w="60" w:type="dxa"/>
+              <w:right w:w="90" w:type="dxa"/>
+            </w:tcMar>
+          </w:tcPr>
+          <w:p>
+            <w:r>
+              <w:rPr>
+                <w:sz w:val="19"/>
+                <w:szCs w:val="19"/>
+              </w:rPr>
+              <w:t xml:space="preserve">26/10/2026</w:t>
+            </w:r>
+          </w:p>
+        </w:tc>
+      </w:tr>
+      <w:tr>
+        <w:tc>
+          <w:tcPr>
+            <w:tcW w:w="2400" w:type="dxa"/>
+            <w:tcBorders>
+              <w:top w:val="single" w:sz="4" w:space="0" w:color="A6A6A6"/>
+              <w:left w:val="single" w:sz="4" w:space="0" w:color="A6A6A6"/>
+              <w:bottom w:val="single" w:sz="4" w:space="0" w:color="A6A6A6"/>
+              <w:right w:val="single" w:sz="4" w:space="0" w:color="A6A6A6"/>
+            </w:tcBorders>
+            <w:tcMar>
+              <w:top w:w="60" w:type="dxa"/>
+              <w:left w:w="90" w:type="dxa"/>
+              <w:bottom w:w="60" w:type="dxa"/>
+              <w:right w:w="90" w:type="dxa"/>
+            </w:tcMar>
+          </w:tcPr>
+          <w:p>
+            <w:r>
+              <w:rPr>
+                <w:sz w:val="19"/>
+                <w:szCs w:val="19"/>
+              </w:rPr>
+              <w:t xml:space="preserve">Reports de WP07 (ADR-127)</w:t>
+            </w:r>
+          </w:p>
+        </w:tc>
+        <w:tc>
+          <w:tcPr>
+            <w:tcW w:w="3800" w:type="dxa"/>
+            <w:tcBorders>
+              <w:top w:val="single" w:sz="4" w:space="0" w:color="A6A6A6"/>
+              <w:left w:val="single" w:sz="4" w:space="0" w:color="A6A6A6"/>
+              <w:bottom w:val="single" w:sz="4" w:space="0" w:color="A6A6A6"/>
+              <w:right w:val="single" w:sz="4" w:space="0" w:color="A6A6A6"/>
+            </w:tcBorders>
+            <w:tcMar>
+              <w:top w:w="60" w:type="dxa"/>
+              <w:left w:w="90" w:type="dxa"/>
+              <w:bottom w:w="60" w:type="dxa"/>
+              <w:right w:w="90" w:type="dxa"/>
+            </w:tcMar>
+          </w:tcPr>
+          <w:p>
+            <w:r>
+              <w:rPr>
+                <w:sz w:val="19"/>
+                <w:szCs w:val="19"/>
+              </w:rPr>
+              <w:t xml:space="preserve">Purge de vendor_pin_check à la mission 13 (OP-N78) ; vendor_id hors de la clé de session (OP-N79)</w:t>
+            </w:r>
+          </w:p>
+        </w:tc>
+        <w:tc>
+          <w:tcPr>
+            <w:tcW w:w="3438" w:type="dxa"/>
+            <w:tcBorders>
+              <w:top w:val="single" w:sz="4" w:space="0" w:color="A6A6A6"/>
+              <w:left w:val="single" w:sz="4" w:space="0" w:color="A6A6A6"/>
+              <w:bottom w:val="single" w:sz="4" w:space="0" w:color="A6A6A6"/>
+              <w:right w:val="single" w:sz="4" w:space="0" w:color="A6A6A6"/>
+            </w:tcBorders>
+            <w:tcMar>
+              <w:top w:w="60" w:type="dxa"/>
+              <w:left w:w="90" w:type="dxa"/>
+              <w:bottom w:w="60" w:type="dxa"/>
+              <w:right w:w="90" w:type="dxa"/>
+            </w:tcMar>
+          </w:tcPr>
+          <w:p>
+            <w:r>
+              <w:rPr>
+                <w:sz w:val="19"/>
+                <w:szCs w:val="19"/>
+              </w:rPr>
+              <w:t xml:space="preserve">26/10/2026</w:t>
+            </w:r>
+          </w:p>
+        </w:tc>
+      </w:tr>
+      <w:tr>
+        <w:tc>
+          <w:tcPr>
+            <w:tcW w:w="2400" w:type="dxa"/>
+            <w:tcBorders>
+              <w:top w:val="single" w:sz="4" w:space="0" w:color="A6A6A6"/>
+              <w:left w:val="single" w:sz="4" w:space="0" w:color="A6A6A6"/>
+              <w:bottom w:val="single" w:sz="4" w:space="0" w:color="A6A6A6"/>
+              <w:right w:val="single" w:sz="4" w:space="0" w:color="A6A6A6"/>
+            </w:tcBorders>
+            <w:tcMar>
+              <w:top w:w="60" w:type="dxa"/>
+              <w:left w:w="90" w:type="dxa"/>
+              <w:bottom w:w="60" w:type="dxa"/>
+              <w:right w:w="90" w:type="dxa"/>
+            </w:tcMar>
+          </w:tcPr>
+          <w:p>
+            <w:r>
+              <w:rPr>
+                <w:sz w:val="19"/>
+                <w:szCs w:val="19"/>
+              </w:rPr>
+              <w:t xml:space="preserve">Paiement en ligne (ADR-128)</w:t>
+            </w:r>
+          </w:p>
+        </w:tc>
+        <w:tc>
+          <w:tcPr>
+            <w:tcW w:w="3800" w:type="dxa"/>
+            <w:tcBorders>
+              <w:top w:val="single" w:sz="4" w:space="0" w:color="A6A6A6"/>
+              <w:left w:val="single" w:sz="4" w:space="0" w:color="A6A6A6"/>
+              <w:bottom w:val="single" w:sz="4" w:space="0" w:color="A6A6A6"/>
+              <w:right w:val="single" w:sz="4" w:space="0" w:color="A6A6A6"/>
+            </w:tcBorders>
+            <w:tcMar>
+              <w:top w:w="60" w:type="dxa"/>
+              <w:left w:w="90" w:type="dxa"/>
+              <w:bottom w:w="60" w:type="dxa"/>
+              <w:right w:w="90" w:type="dxa"/>
+            </w:tcMar>
+          </w:tcPr>
+          <w:p>
+            <w:r>
+              <w:rPr>
+                <w:sz w:val="19"/>
+                <w:szCs w:val="19"/>
+              </w:rPr>
+              <w:t xml:space="preserve">Solde rendu, époque dans le refus, empreinte du contenu</w:t>
+            </w:r>
+          </w:p>
+        </w:tc>
+        <w:tc>
+          <w:tcPr>
+            <w:tcW w:w="3438" w:type="dxa"/>
+            <w:tcBorders>
+              <w:top w:val="single" w:sz="4" w:space="0" w:color="A6A6A6"/>
+              <w:left w:val="single" w:sz="4" w:space="0" w:color="A6A6A6"/>
+              <w:bottom w:val="single" w:sz="4" w:space="0" w:color="A6A6A6"/>
+              <w:right w:val="single" w:sz="4" w:space="0" w:color="A6A6A6"/>
+            </w:tcBorders>
+            <w:tcMar>
+              <w:top w:w="60" w:type="dxa"/>
+              <w:left w:w="90" w:type="dxa"/>
+              <w:bottom w:w="60" w:type="dxa"/>
+              <w:right w:w="90" w:type="dxa"/>
+            </w:tcMar>
+          </w:tcPr>
+          <w:p>
+            <w:r>
+              <w:rPr>
+                <w:sz w:val="19"/>
+                <w:szCs w:val="19"/>
+              </w:rPr>
+              <w:t xml:space="preserve">26/10/2026</w:t>
+            </w:r>
+          </w:p>
+        </w:tc>
+      </w:tr>
+      <w:tr>
+        <w:tc>
+          <w:tcPr>
+            <w:tcW w:w="2400" w:type="dxa"/>
+            <w:tcBorders>
+              <w:top w:val="single" w:sz="4" w:space="0" w:color="A6A6A6"/>
+              <w:left w:val="single" w:sz="4" w:space="0" w:color="A6A6A6"/>
+              <w:bottom w:val="single" w:sz="4" w:space="0" w:color="A6A6A6"/>
+              <w:right w:val="single" w:sz="4" w:space="0" w:color="A6A6A6"/>
+            </w:tcBorders>
+            <w:tcMar>
+              <w:top w:w="60" w:type="dxa"/>
+              <w:left w:w="90" w:type="dxa"/>
+              <w:bottom w:w="60" w:type="dxa"/>
+              <w:right w:w="90" w:type="dxa"/>
+            </w:tcMar>
+          </w:tcPr>
+          <w:p>
+            <w:r>
+              <w:rPr>
+                <w:sz w:val="19"/>
+                <w:szCs w:val="19"/>
+              </w:rPr>
+              <w:t xml:space="preserve">Annulation au back-office (ADR-129)</w:t>
+            </w:r>
+          </w:p>
+        </w:tc>
+        <w:tc>
+          <w:tcPr>
+            <w:tcW w:w="3800" w:type="dxa"/>
+            <w:tcBorders>
+              <w:top w:val="single" w:sz="4" w:space="0" w:color="A6A6A6"/>
+              <w:left w:val="single" w:sz="4" w:space="0" w:color="A6A6A6"/>
+              <w:bottom w:val="single" w:sz="4" w:space="0" w:color="A6A6A6"/>
+              <w:right w:val="single" w:sz="4" w:space="0" w:color="A6A6A6"/>
+            </w:tcBorders>
+            <w:tcMar>
+              <w:top w:w="60" w:type="dxa"/>
+              <w:left w:w="90" w:type="dxa"/>
+              <w:bottom w:w="60" w:type="dxa"/>
+              <w:right w:w="90" w:type="dxa"/>
+            </w:tcMar>
+          </w:tcPr>
+          <w:p>
+            <w:r>
+              <w:rPr>
+                <w:sz w:val="19"/>
+                <w:szCs w:val="19"/>
+              </w:rPr>
+              <w:t xml:space="preserve">reversePayment d’une personne crée une demande SALE_REVERSAL (202), exécutée par une seconde personne</w:t>
+            </w:r>
+          </w:p>
+        </w:tc>
+        <w:tc>
+          <w:tcPr>
+            <w:tcW w:w="3438" w:type="dxa"/>
+            <w:tcBorders>
+              <w:top w:val="single" w:sz="4" w:space="0" w:color="A6A6A6"/>
+              <w:left w:val="single" w:sz="4" w:space="0" w:color="A6A6A6"/>
+              <w:bottom w:val="single" w:sz="4" w:space="0" w:color="A6A6A6"/>
+              <w:right w:val="single" w:sz="4" w:space="0" w:color="A6A6A6"/>
+            </w:tcBorders>
+            <w:tcMar>
+              <w:top w:w="60" w:type="dxa"/>
+              <w:left w:w="90" w:type="dxa"/>
+              <w:bottom w:w="60" w:type="dxa"/>
+              <w:right w:w="90" w:type="dxa"/>
+            </w:tcMar>
+          </w:tcPr>
+          <w:p>
+            <w:r>
+              <w:rPr>
+                <w:sz w:val="19"/>
+                <w:szCs w:val="19"/>
+              </w:rPr>
+              <w:t xml:space="preserve">26/10/2026</w:t>
+            </w:r>
+          </w:p>
+        </w:tc>
+      </w:tr>
+      <w:tr>
+        <w:tc>
+          <w:tcPr>
+            <w:tcW w:w="2400" w:type="dxa"/>
+            <w:tcBorders>
+              <w:top w:val="single" w:sz="4" w:space="0" w:color="A6A6A6"/>
+              <w:left w:val="single" w:sz="4" w:space="0" w:color="A6A6A6"/>
+              <w:bottom w:val="single" w:sz="4" w:space="0" w:color="A6A6A6"/>
+              <w:right w:val="single" w:sz="4" w:space="0" w:color="A6A6A6"/>
+            </w:tcBorders>
+            <w:tcMar>
+              <w:top w:w="60" w:type="dxa"/>
+              <w:left w:w="90" w:type="dxa"/>
+              <w:bottom w:w="60" w:type="dxa"/>
+              <w:right w:w="90" w:type="dxa"/>
+            </w:tcMar>
+          </w:tcPr>
+          <w:p>
+            <w:r>
+              <w:rPr>
+                <w:sz w:val="19"/>
+                <w:szCs w:val="19"/>
+              </w:rPr>
+              <w:t xml:space="preserve">Verrou d’essai de PIN (ADR-130)</w:t>
+            </w:r>
+          </w:p>
+        </w:tc>
+        <w:tc>
+          <w:tcPr>
+            <w:tcW w:w="3800" w:type="dxa"/>
+            <w:tcBorders>
+              <w:top w:val="single" w:sz="4" w:space="0" w:color="A6A6A6"/>
+              <w:left w:val="single" w:sz="4" w:space="0" w:color="A6A6A6"/>
+              <w:bottom w:val="single" w:sz="4" w:space="0" w:color="A6A6A6"/>
+              <w:right w:val="single" w:sz="4" w:space="0" w:color="A6A6A6"/>
+            </w:tcBorders>
+            <w:tcMar>
+              <w:top w:w="60" w:type="dxa"/>
+              <w:left w:w="90" w:type="dxa"/>
+              <w:bottom w:w="60" w:type="dxa"/>
+              <w:right w:w="90" w:type="dxa"/>
+            </w:tcMar>
+          </w:tcPr>
+          <w:p>
+            <w:r>
+              <w:rPr>
+                <w:sz w:val="19"/>
+                <w:szCs w:val="19"/>
+              </w:rPr>
+              <w:t xml:space="preserve">Pool du verrou non dimensionné, accepté (OP-N80, mission 13)</w:t>
+            </w:r>
+          </w:p>
+        </w:tc>
+        <w:tc>
+          <w:tcPr>
+            <w:tcW w:w="3438" w:type="dxa"/>
+            <w:tcBorders>
+              <w:top w:val="single" w:sz="4" w:space="0" w:color="A6A6A6"/>
+              <w:left w:val="single" w:sz="4" w:space="0" w:color="A6A6A6"/>
+              <w:bottom w:val="single" w:sz="4" w:space="0" w:color="A6A6A6"/>
+              <w:right w:val="single" w:sz="4" w:space="0" w:color="A6A6A6"/>
+            </w:tcBorders>
+            <w:tcMar>
+              <w:top w:w="60" w:type="dxa"/>
+              <w:left w:w="90" w:type="dxa"/>
+              <w:bottom w:w="60" w:type="dxa"/>
+              <w:right w:w="90" w:type="dxa"/>
+            </w:tcMar>
+          </w:tcPr>
+          <w:p>
+            <w:r>
+              <w:rPr>
+                <w:sz w:val="19"/>
+                <w:szCs w:val="19"/>
+              </w:rPr>
+              <w:t xml:space="preserve">26/10/2026</w:t>
+            </w:r>
+          </w:p>
+        </w:tc>
+      </w:tr>
+      <w:tr>
+        <w:tc>
+          <w:tcPr>
+            <w:tcW w:w="2400" w:type="dxa"/>
+            <w:tcBorders>
+              <w:top w:val="single" w:sz="4" w:space="0" w:color="A6A6A6"/>
+              <w:left w:val="single" w:sz="4" w:space="0" w:color="A6A6A6"/>
+              <w:bottom w:val="single" w:sz="4" w:space="0" w:color="A6A6A6"/>
+              <w:right w:val="single" w:sz="4" w:space="0" w:color="A6A6A6"/>
+            </w:tcBorders>
+            <w:tcMar>
+              <w:top w:w="60" w:type="dxa"/>
+              <w:left w:w="90" w:type="dxa"/>
+              <w:bottom w:w="60" w:type="dxa"/>
+              <w:right w:w="90" w:type="dxa"/>
+            </w:tcMar>
+          </w:tcPr>
+          <w:p>
+            <w:r>
+              <w:rPr>
+                <w:sz w:val="19"/>
+                <w:szCs w:val="19"/>
+              </w:rPr>
+              <w:t xml:space="preserve">Identification au guichet</w:t>
+            </w:r>
+          </w:p>
+        </w:tc>
+        <w:tc>
+          <w:tcPr>
+            <w:tcW w:w="3800" w:type="dxa"/>
+            <w:tcBorders>
+              <w:top w:val="single" w:sz="4" w:space="0" w:color="A6A6A6"/>
+              <w:left w:val="single" w:sz="4" w:space="0" w:color="A6A6A6"/>
+              <w:bottom w:val="single" w:sz="4" w:space="0" w:color="A6A6A6"/>
+              <w:right w:val="single" w:sz="4" w:space="0" w:color="A6A6A6"/>
+            </w:tcBorders>
+            <w:tcMar>
+              <w:top w:w="60" w:type="dxa"/>
+              <w:left w:w="90" w:type="dxa"/>
+              <w:bottom w:w="60" w:type="dxa"/>
+              <w:right w:w="90" w:type="dxa"/>
+            </w:tcMar>
+          </w:tcPr>
+          <w:p>
+            <w:r>
+              <w:rPr>
+                <w:sz w:val="19"/>
+                <w:szCs w:val="19"/>
+              </w:rPr>
+              <w:t xml:space="preserve">FR-021 à FR-023 retirés de la matrice, reportés à la mission 10 ; NFR-010 sur preuve locale</w:t>
+            </w:r>
+          </w:p>
+        </w:tc>
+        <w:tc>
+          <w:tcPr>
+            <w:tcW w:w="3438" w:type="dxa"/>
+            <w:tcBorders>
+              <w:top w:val="single" w:sz="4" w:space="0" w:color="A6A6A6"/>
+              <w:left w:val="single" w:sz="4" w:space="0" w:color="A6A6A6"/>
+              <w:bottom w:val="single" w:sz="4" w:space="0" w:color="A6A6A6"/>
+              <w:right w:val="single" w:sz="4" w:space="0" w:color="A6A6A6"/>
+            </w:tcBorders>
+            <w:tcMar>
+              <w:top w:w="60" w:type="dxa"/>
+              <w:left w:w="90" w:type="dxa"/>
+              <w:bottom w:w="60" w:type="dxa"/>
+              <w:right w:w="90" w:type="dxa"/>
+            </w:tcMar>
+          </w:tcPr>
+          <w:p>
+            <w:r>
+              <w:rPr>
+                <w:sz w:val="19"/>
+                <w:szCs w:val="19"/>
+              </w:rPr>
+              <w:t xml:space="preserve">26/10/2026</w:t>
+            </w:r>
+          </w:p>
+        </w:tc>
+      </w:tr>
     </w:tbl>
     <w:p>
       <w:pPr>
@@ -6112,6 +6592,246 @@
           </w:p>
         </w:tc>
       </w:tr>
+      <w:tr>
+        <w:tc>
+          <w:tcPr>
+            <w:tcW w:w="2400" w:type="dxa"/>
+            <w:tcBorders>
+              <w:top w:val="single" w:sz="4" w:space="0" w:color="A6A6A6"/>
+              <w:left w:val="single" w:sz="4" w:space="0" w:color="A6A6A6"/>
+              <w:bottom w:val="single" w:sz="4" w:space="0" w:color="A6A6A6"/>
+              <w:right w:val="single" w:sz="4" w:space="0" w:color="A6A6A6"/>
+            </w:tcBorders>
+            <w:tcMar>
+              <w:top w:w="60" w:type="dxa"/>
+              <w:left w:w="90" w:type="dxa"/>
+              <w:bottom w:w="60" w:type="dxa"/>
+              <w:right w:w="90" w:type="dxa"/>
+            </w:tcMar>
+          </w:tcPr>
+          <w:p>
+            <w:r>
+              <w:rPr>
+                <w:sz w:val="19"/>
+                <w:szCs w:val="19"/>
+              </w:rPr>
+              <w:t xml:space="preserve">OP-N78 (ADR-127)</w:t>
+            </w:r>
+          </w:p>
+        </w:tc>
+        <w:tc>
+          <w:tcPr>
+            <w:tcW w:w="3800" w:type="dxa"/>
+            <w:tcBorders>
+              <w:top w:val="single" w:sz="4" w:space="0" w:color="A6A6A6"/>
+              <w:left w:val="single" w:sz="4" w:space="0" w:color="A6A6A6"/>
+              <w:bottom w:val="single" w:sz="4" w:space="0" w:color="A6A6A6"/>
+              <w:right w:val="single" w:sz="4" w:space="0" w:color="A6A6A6"/>
+            </w:tcBorders>
+            <w:tcMar>
+              <w:top w:w="60" w:type="dxa"/>
+              <w:left w:w="90" w:type="dxa"/>
+              <w:bottom w:w="60" w:type="dxa"/>
+              <w:right w:w="90" w:type="dxa"/>
+            </w:tcMar>
+          </w:tcPr>
+          <w:p>
+            <w:r>
+              <w:rPr>
+                <w:sz w:val="19"/>
+                <w:szCs w:val="19"/>
+              </w:rPr>
+              <w:t xml:space="preserve">Registre des essais de PIN sans purge</w:t>
+            </w:r>
+          </w:p>
+        </w:tc>
+        <w:tc>
+          <w:tcPr>
+            <w:tcW w:w="3438" w:type="dxa"/>
+            <w:tcBorders>
+              <w:top w:val="single" w:sz="4" w:space="0" w:color="A6A6A6"/>
+              <w:left w:val="single" w:sz="4" w:space="0" w:color="A6A6A6"/>
+              <w:bottom w:val="single" w:sz="4" w:space="0" w:color="A6A6A6"/>
+              <w:right w:val="single" w:sz="4" w:space="0" w:color="A6A6A6"/>
+            </w:tcBorders>
+            <w:tcMar>
+              <w:top w:w="60" w:type="dxa"/>
+              <w:left w:w="90" w:type="dxa"/>
+              <w:bottom w:w="60" w:type="dxa"/>
+              <w:right w:w="90" w:type="dxa"/>
+            </w:tcMar>
+          </w:tcPr>
+          <w:p>
+            <w:r>
+              <w:rPr>
+                <w:sz w:val="19"/>
+                <w:szCs w:val="19"/>
+              </w:rPr>
+              <w:t xml:space="preserve">Mission 13</w:t>
+            </w:r>
+          </w:p>
+        </w:tc>
+      </w:tr>
+      <w:tr>
+        <w:tc>
+          <w:tcPr>
+            <w:tcW w:w="2400" w:type="dxa"/>
+            <w:tcBorders>
+              <w:top w:val="single" w:sz="4" w:space="0" w:color="A6A6A6"/>
+              <w:left w:val="single" w:sz="4" w:space="0" w:color="A6A6A6"/>
+              <w:bottom w:val="single" w:sz="4" w:space="0" w:color="A6A6A6"/>
+              <w:right w:val="single" w:sz="4" w:space="0" w:color="A6A6A6"/>
+            </w:tcBorders>
+            <w:tcMar>
+              <w:top w:w="60" w:type="dxa"/>
+              <w:left w:w="90" w:type="dxa"/>
+              <w:bottom w:w="60" w:type="dxa"/>
+              <w:right w:w="90" w:type="dxa"/>
+            </w:tcMar>
+          </w:tcPr>
+          <w:p>
+            <w:r>
+              <w:rPr>
+                <w:sz w:val="19"/>
+                <w:szCs w:val="19"/>
+              </w:rPr>
+              <w:t xml:space="preserve">OP-N79 (ADR-127)</w:t>
+            </w:r>
+          </w:p>
+        </w:tc>
+        <w:tc>
+          <w:tcPr>
+            <w:tcW w:w="3800" w:type="dxa"/>
+            <w:tcBorders>
+              <w:top w:val="single" w:sz="4" w:space="0" w:color="A6A6A6"/>
+              <w:left w:val="single" w:sz="4" w:space="0" w:color="A6A6A6"/>
+              <w:bottom w:val="single" w:sz="4" w:space="0" w:color="A6A6A6"/>
+              <w:right w:val="single" w:sz="4" w:space="0" w:color="A6A6A6"/>
+            </w:tcBorders>
+            <w:tcMar>
+              <w:top w:w="60" w:type="dxa"/>
+              <w:left w:w="90" w:type="dxa"/>
+              <w:bottom w:w="60" w:type="dxa"/>
+              <w:right w:w="90" w:type="dxa"/>
+            </w:tcMar>
+          </w:tcPr>
+          <w:p>
+            <w:r>
+              <w:rPr>
+                <w:sz w:val="19"/>
+                <w:szCs w:val="19"/>
+              </w:rPr>
+              <w:t xml:space="preserve">vendor_id hors de la clé composite de vendor_session</w:t>
+            </w:r>
+          </w:p>
+        </w:tc>
+        <w:tc>
+          <w:tcPr>
+            <w:tcW w:w="3438" w:type="dxa"/>
+            <w:tcBorders>
+              <w:top w:val="single" w:sz="4" w:space="0" w:color="A6A6A6"/>
+              <w:left w:val="single" w:sz="4" w:space="0" w:color="A6A6A6"/>
+              <w:bottom w:val="single" w:sz="4" w:space="0" w:color="A6A6A6"/>
+              <w:right w:val="single" w:sz="4" w:space="0" w:color="A6A6A6"/>
+            </w:tcBorders>
+            <w:tcMar>
+              <w:top w:w="60" w:type="dxa"/>
+              <w:left w:w="90" w:type="dxa"/>
+              <w:bottom w:w="60" w:type="dxa"/>
+              <w:right w:w="90" w:type="dxa"/>
+            </w:tcMar>
+          </w:tcPr>
+          <w:p>
+            <w:r>
+              <w:rPr>
+                <w:sz w:val="19"/>
+                <w:szCs w:val="19"/>
+              </w:rPr>
+              <w:t xml:space="preserve">Mission 11</w:t>
+            </w:r>
+          </w:p>
+        </w:tc>
+      </w:tr>
+      <w:tr>
+        <w:tc>
+          <w:tcPr>
+            <w:tcW w:w="2400" w:type="dxa"/>
+            <w:tcBorders>
+              <w:top w:val="single" w:sz="4" w:space="0" w:color="A6A6A6"/>
+              <w:left w:val="single" w:sz="4" w:space="0" w:color="A6A6A6"/>
+              <w:bottom w:val="single" w:sz="4" w:space="0" w:color="A6A6A6"/>
+              <w:right w:val="single" w:sz="4" w:space="0" w:color="A6A6A6"/>
+            </w:tcBorders>
+            <w:tcMar>
+              <w:top w:w="60" w:type="dxa"/>
+              <w:left w:w="90" w:type="dxa"/>
+              <w:bottom w:w="60" w:type="dxa"/>
+              <w:right w:w="90" w:type="dxa"/>
+            </w:tcMar>
+          </w:tcPr>
+          <w:p>
+            <w:r>
+              <w:rPr>
+                <w:sz w:val="19"/>
+                <w:szCs w:val="19"/>
+              </w:rPr>
+              <w:t xml:space="preserve">OP-N80 (ADR-130)</w:t>
+            </w:r>
+          </w:p>
+        </w:tc>
+        <w:tc>
+          <w:tcPr>
+            <w:tcW w:w="3800" w:type="dxa"/>
+            <w:tcBorders>
+              <w:top w:val="single" w:sz="4" w:space="0" w:color="A6A6A6"/>
+              <w:left w:val="single" w:sz="4" w:space="0" w:color="A6A6A6"/>
+              <w:bottom w:val="single" w:sz="4" w:space="0" w:color="A6A6A6"/>
+              <w:right w:val="single" w:sz="4" w:space="0" w:color="A6A6A6"/>
+            </w:tcBorders>
+            <w:tcMar>
+              <w:top w:w="60" w:type="dxa"/>
+              <w:left w:w="90" w:type="dxa"/>
+              <w:bottom w:w="60" w:type="dxa"/>
+              <w:right w:w="90" w:type="dxa"/>
+            </w:tcMar>
+          </w:tcPr>
+          <w:p>
+            <w:r>
+              <w:rPr>
+                <w:sz w:val="19"/>
+                <w:szCs w:val="19"/>
+              </w:rPr>
+              <w:t xml:space="preserve">Verrou d’essai de PIN : pool non dimensionné (500 au lieu de 429 au-delà), sans test de borne</w:t>
+            </w:r>
+          </w:p>
+        </w:tc>
+        <w:tc>
+          <w:tcPr>
+            <w:tcW w:w="3438" w:type="dxa"/>
+            <w:tcBorders>
+              <w:top w:val="single" w:sz="4" w:space="0" w:color="A6A6A6"/>
+              <w:left w:val="single" w:sz="4" w:space="0" w:color="A6A6A6"/>
+              <w:bottom w:val="single" w:sz="4" w:space="0" w:color="A6A6A6"/>
+              <w:right w:val="single" w:sz="4" w:space="0" w:color="A6A6A6"/>
+            </w:tcBorders>
+            <w:tcMar>
+              <w:top w:w="60" w:type="dxa"/>
+              <w:left w:w="90" w:type="dxa"/>
+              <w:bottom w:w="60" w:type="dxa"/>
+              <w:right w:w="90" w:type="dxa"/>
+            </w:tcMar>
+          </w:tcPr>
+          <w:p>
+            <w:r>
+              <w:rPr>
+                <w:sz w:val="19"/>
+                <w:szCs w:val="19"/>
+              </w:rPr>
+              <w:t xml:space="preserve">Mission 13</w:t>
+            </w:r>
+          </w:p>
+        </w:tc>
+      </w:tr>
     </w:tbl>
     <w:p>
       <w:pPr>
@@ -6612,7 +7332,7 @@
         <w:spacing w:after="120"/>
       </w:pPr>
       <w:r>
-        <w:t xml:space="preserve">Chaque lot est relu par un agent distinct de celui qui l’a écrit, dans une session séparée. Les tests sont rejoués en série par l’agent principal sur la base partagée. Fichiers à faire relire par une personne (règle 4) : 0031_vendors.sql, 0033_payments.sql (assert_reversible, clé de sale_attribution), apps/api/src/vendor-pin/, config.ts, device-or-caller.guard.ts, idempotency.interceptor.ts.</w:t>
+        <w:t xml:space="preserve">Chaque lot est relu par un agent distinct de celui qui l’a écrit, dans une session séparée. Les tests sont rejoués en série par l’agent principal sur la base partagée. Fichiers à faire relire par une personne (règle 4) : migrations 0031, 0033 (assert_reversible, clé de sale_attribution), 0034 (jetons QR) et 0035, post-roles.sql (droits de cashless_app), apps/api/src/vendor-pin/, pin-attempt-lock.ts et session-lock.ts, config.ts, device-or-caller.guard.ts, idempotency.interceptor.ts, qr-token.ts et qr-token-hash.ts, sale-reversal-action.ts (liste complétée par la revue post-fusion du 27/10/2026).</w:t>
       </w:r>
     </w:p>
     <w:p>
@@ -7456,7 +8176,7 @@
                 <w:sz w:val="19"/>
                 <w:szCs w:val="19"/>
               </w:rPr>
-              <w:t xml:space="preserve">En cours</w:t>
+              <w:t xml:space="preserve">Approuvé (cycle 2)</w:t>
             </w:r>
           </w:p>
         </w:tc>
@@ -7720,7 +8440,7 @@
                 <w:sz w:val="19"/>
                 <w:szCs w:val="19"/>
               </w:rPr>
-              <w:t xml:space="preserve">Prévu</w:t>
+              <w:t xml:space="preserve">Approuvé</w:t>
             </w:r>
           </w:p>
         </w:tc>
@@ -7984,7 +8704,7 @@
                 <w:sz w:val="19"/>
                 <w:szCs w:val="19"/>
               </w:rPr>
-              <w:t xml:space="preserve">Prévu</w:t>
+              <w:t xml:space="preserve">Approuvé (cycle 3)</w:t>
             </w:r>
           </w:p>
         </w:tc>
@@ -8116,7 +8836,7 @@
                 <w:sz w:val="19"/>
                 <w:szCs w:val="19"/>
               </w:rPr>
-              <w:t xml:space="preserve">Prévu</w:t>
+              <w:t xml:space="preserve">Approuvé</w:t>
             </w:r>
           </w:p>
         </w:tc>
@@ -8248,7 +8968,7 @@
                 <w:sz w:val="19"/>
                 <w:szCs w:val="19"/>
               </w:rPr>
-              <w:t xml:space="preserve">Prévu</w:t>
+              <w:t xml:space="preserve">Approuvé (cycle 2)</w:t>
             </w:r>
           </w:p>
         </w:tc>
@@ -8380,7 +9100,7 @@
                 <w:sz w:val="19"/>
                 <w:szCs w:val="19"/>
               </w:rPr>
-              <w:t xml:space="preserve">Prévu</w:t>
+              <w:t xml:space="preserve">Approuvé</w:t>
             </w:r>
           </w:p>
         </w:tc>
@@ -8512,7 +9232,7 @@
                 <w:sz w:val="19"/>
                 <w:szCs w:val="19"/>
               </w:rPr>
-              <w:t xml:space="preserve">Prévu</w:t>
+              <w:t xml:space="preserve">Approuvé</w:t>
             </w:r>
           </w:p>
         </w:tc>
@@ -8644,7 +9364,7 @@
                 <w:sz w:val="19"/>
                 <w:szCs w:val="19"/>
               </w:rPr>
-              <w:t xml:space="preserve">Prévu</w:t>
+              <w:t xml:space="preserve">Approuvé</w:t>
             </w:r>
           </w:p>
         </w:tc>
@@ -8668,33 +9388,7 @@
         <w:spacing w:after="60"/>
       </w:pPr>
       <w:r>
-        <w:t xml:space="preserve">Fait : WP01, WP02, WP03, WP04, WP06, WP08.</w:t>
-      </w:r>
-    </w:p>
-    <w:p>
-      <w:pPr>
-        <w:pStyle w:val="Paragraphedeliste"/>
-        <w:numPr>
-          <w:ilvl w:val="0"/>
-          <w:numId w:val="2"/>
-        </w:numPr>
-        <w:spacing w:after="60"/>
-      </w:pPr>
-      <w:r>
-        <w:t xml:space="preserve">Maintenant : WP05 ; puis WP07, qui attend WP05.</w:t>
-      </w:r>
-    </w:p>
-    <w:p>
-      <w:pPr>
-        <w:pStyle w:val="Paragraphedeliste"/>
-        <w:numPr>
-          <w:ilvl w:val="0"/>
-          <w:numId w:val="2"/>
-        </w:numPr>
-        <w:spacing w:after="60"/>
-      </w:pPr>
-      <w:r>
-        <w:t xml:space="preserve">Après WP07 : WP09 et WP10 en parallèle ; puis WP11 ; puis WP12 et WP13 en parallèle ; WP14 ferme la mission.</w:t>
+        <w:t xml:space="preserve">Fait : les 14 lots, dans l’ordre prévu (WP05 puis WP07 ; WP09 et WP10 en parallèle ; WP11 ; WP12 et WP13 en parallèle ; WP14 ferme la mission).</w:t>
       </w:r>
     </w:p>
     <w:p>
@@ -9104,7 +9798,7 @@
                 <w:sz w:val="19"/>
                 <w:szCs w:val="19"/>
               </w:rPr>
-              <w:t xml:space="preserve">En cours</w:t>
+              <w:t xml:space="preserve">Faites</w:t>
             </w:r>
           </w:p>
         </w:tc>
@@ -9130,7 +9824,7 @@
                 <w:sz w:val="19"/>
                 <w:szCs w:val="19"/>
               </w:rPr>
-              <w:t xml:space="preserve">6 lots approuvés sur 14 au 23/10/2026</w:t>
+              <w:t xml:space="preserve">14 lots approuvés au 26/10/2026 (cycles 2 et 3 pour WP02, WP03, WP05, WP09, WP11)</w:t>
             </w:r>
           </w:p>
         </w:tc>
@@ -9184,6 +9878,246 @@
                 <w:sz w:val="19"/>
                 <w:szCs w:val="19"/>
               </w:rPr>
+              <w:t xml:space="preserve">Fait</w:t>
+            </w:r>
+          </w:p>
+        </w:tc>
+        <w:tc>
+          <w:tcPr>
+            <w:tcW w:w="3438" w:type="dxa"/>
+            <w:tcBorders>
+              <w:top w:val="single" w:sz="4" w:space="0" w:color="A6A6A6"/>
+              <w:left w:val="single" w:sz="4" w:space="0" w:color="A6A6A6"/>
+              <w:bottom w:val="single" w:sz="4" w:space="0" w:color="A6A6A6"/>
+              <w:right w:val="single" w:sz="4" w:space="0" w:color="A6A6A6"/>
+            </w:tcBorders>
+            <w:tcMar>
+              <w:top w:w="60" w:type="dxa"/>
+              <w:left w:w="90" w:type="dxa"/>
+              <w:bottom w:w="60" w:type="dxa"/>
+              <w:right w:w="90" w:type="dxa"/>
+            </w:tcMar>
+          </w:tcPr>
+          <w:p>
+            <w:r>
+              <w:rPr>
+                <w:sz w:val="19"/>
+                <w:szCs w:val="19"/>
+              </w:rPr>
+              <w:t xml:space="preserve">26/10/2026, réponses confirmées par le porteur</w:t>
+            </w:r>
+          </w:p>
+        </w:tc>
+      </w:tr>
+      <w:tr>
+        <w:tc>
+          <w:tcPr>
+            <w:tcW w:w="2400" w:type="dxa"/>
+            <w:tcBorders>
+              <w:top w:val="single" w:sz="4" w:space="0" w:color="A6A6A6"/>
+              <w:left w:val="single" w:sz="4" w:space="0" w:color="A6A6A6"/>
+              <w:bottom w:val="single" w:sz="4" w:space="0" w:color="A6A6A6"/>
+              <w:right w:val="single" w:sz="4" w:space="0" w:color="A6A6A6"/>
+            </w:tcBorders>
+            <w:tcMar>
+              <w:top w:w="60" w:type="dxa"/>
+              <w:left w:w="90" w:type="dxa"/>
+              <w:bottom w:w="60" w:type="dxa"/>
+              <w:right w:w="90" w:type="dxa"/>
+            </w:tcMar>
+          </w:tcPr>
+          <w:p>
+            <w:r>
+              <w:rPr>
+                <w:sz w:val="19"/>
+                <w:szCs w:val="19"/>
+              </w:rPr>
+              <w:t xml:space="preserve">Accept et merge</w:t>
+            </w:r>
+          </w:p>
+        </w:tc>
+        <w:tc>
+          <w:tcPr>
+            <w:tcW w:w="3800" w:type="dxa"/>
+            <w:tcBorders>
+              <w:top w:val="single" w:sz="4" w:space="0" w:color="A6A6A6"/>
+              <w:left w:val="single" w:sz="4" w:space="0" w:color="A6A6A6"/>
+              <w:bottom w:val="single" w:sz="4" w:space="0" w:color="A6A6A6"/>
+              <w:right w:val="single" w:sz="4" w:space="0" w:color="A6A6A6"/>
+            </w:tcBorders>
+            <w:tcMar>
+              <w:top w:w="60" w:type="dxa"/>
+              <w:left w:w="90" w:type="dxa"/>
+              <w:bottom w:w="60" w:type="dxa"/>
+              <w:right w:w="90" w:type="dxa"/>
+            </w:tcMar>
+          </w:tcPr>
+          <w:p>
+            <w:r>
+              <w:rPr>
+                <w:sz w:val="19"/>
+                <w:szCs w:val="19"/>
+              </w:rPr>
+              <w:t xml:space="preserve">Faits</w:t>
+            </w:r>
+          </w:p>
+        </w:tc>
+        <w:tc>
+          <w:tcPr>
+            <w:tcW w:w="3438" w:type="dxa"/>
+            <w:tcBorders>
+              <w:top w:val="single" w:sz="4" w:space="0" w:color="A6A6A6"/>
+              <w:left w:val="single" w:sz="4" w:space="0" w:color="A6A6A6"/>
+              <w:bottom w:val="single" w:sz="4" w:space="0" w:color="A6A6A6"/>
+              <w:right w:val="single" w:sz="4" w:space="0" w:color="A6A6A6"/>
+            </w:tcBorders>
+            <w:tcMar>
+              <w:top w:w="60" w:type="dxa"/>
+              <w:left w:w="90" w:type="dxa"/>
+              <w:bottom w:w="60" w:type="dxa"/>
+              <w:right w:w="90" w:type="dxa"/>
+            </w:tcMar>
+          </w:tcPr>
+          <w:p>
+            <w:r>
+              <w:rPr>
+                <w:sz w:val="19"/>
+                <w:szCs w:val="19"/>
+              </w:rPr>
+              <w:t xml:space="preserve">26/10/2026 (4922ef83, squash 870bd3f4 sur feat)</w:t>
+            </w:r>
+          </w:p>
+        </w:tc>
+      </w:tr>
+      <w:tr>
+        <w:tc>
+          <w:tcPr>
+            <w:tcW w:w="2400" w:type="dxa"/>
+            <w:tcBorders>
+              <w:top w:val="single" w:sz="4" w:space="0" w:color="A6A6A6"/>
+              <w:left w:val="single" w:sz="4" w:space="0" w:color="A6A6A6"/>
+              <w:bottom w:val="single" w:sz="4" w:space="0" w:color="A6A6A6"/>
+              <w:right w:val="single" w:sz="4" w:space="0" w:color="A6A6A6"/>
+            </w:tcBorders>
+            <w:tcMar>
+              <w:top w:w="60" w:type="dxa"/>
+              <w:left w:w="90" w:type="dxa"/>
+              <w:bottom w:w="60" w:type="dxa"/>
+              <w:right w:w="90" w:type="dxa"/>
+            </w:tcMar>
+          </w:tcPr>
+          <w:p>
+            <w:r>
+              <w:rPr>
+                <w:sz w:val="19"/>
+                <w:szCs w:val="19"/>
+              </w:rPr>
+              <w:t xml:space="preserve">Revue post-fusion</w:t>
+            </w:r>
+          </w:p>
+        </w:tc>
+        <w:tc>
+          <w:tcPr>
+            <w:tcW w:w="3800" w:type="dxa"/>
+            <w:tcBorders>
+              <w:top w:val="single" w:sz="4" w:space="0" w:color="A6A6A6"/>
+              <w:left w:val="single" w:sz="4" w:space="0" w:color="A6A6A6"/>
+              <w:bottom w:val="single" w:sz="4" w:space="0" w:color="A6A6A6"/>
+              <w:right w:val="single" w:sz="4" w:space="0" w:color="A6A6A6"/>
+            </w:tcBorders>
+            <w:tcMar>
+              <w:top w:w="60" w:type="dxa"/>
+              <w:left w:w="90" w:type="dxa"/>
+              <w:bottom w:w="60" w:type="dxa"/>
+              <w:right w:w="90" w:type="dxa"/>
+            </w:tcMar>
+          </w:tcPr>
+          <w:p>
+            <w:r>
+              <w:rPr>
+                <w:sz w:val="19"/>
+                <w:szCs w:val="19"/>
+              </w:rPr>
+              <w:t xml:space="preserve">Faite</w:t>
+            </w:r>
+          </w:p>
+        </w:tc>
+        <w:tc>
+          <w:tcPr>
+            <w:tcW w:w="3438" w:type="dxa"/>
+            <w:tcBorders>
+              <w:top w:val="single" w:sz="4" w:space="0" w:color="A6A6A6"/>
+              <w:left w:val="single" w:sz="4" w:space="0" w:color="A6A6A6"/>
+              <w:bottom w:val="single" w:sz="4" w:space="0" w:color="A6A6A6"/>
+              <w:right w:val="single" w:sz="4" w:space="0" w:color="A6A6A6"/>
+            </w:tcBorders>
+            <w:tcMar>
+              <w:top w:w="60" w:type="dxa"/>
+              <w:left w:w="90" w:type="dxa"/>
+              <w:bottom w:w="60" w:type="dxa"/>
+              <w:right w:w="90" w:type="dxa"/>
+            </w:tcMar>
+          </w:tcPr>
+          <w:p>
+            <w:r>
+              <w:rPr>
+                <w:sz w:val="19"/>
+                <w:szCs w:val="19"/>
+              </w:rPr>
+              <w:t xml:space="preserve">27/10/2026 : publiable avec réserves (docs/passation-5b/rapports/mission-review-5b.md)</w:t>
+            </w:r>
+          </w:p>
+        </w:tc>
+      </w:tr>
+      <w:tr>
+        <w:tc>
+          <w:tcPr>
+            <w:tcW w:w="2400" w:type="dxa"/>
+            <w:tcBorders>
+              <w:top w:val="single" w:sz="4" w:space="0" w:color="A6A6A6"/>
+              <w:left w:val="single" w:sz="4" w:space="0" w:color="A6A6A6"/>
+              <w:bottom w:val="single" w:sz="4" w:space="0" w:color="A6A6A6"/>
+              <w:right w:val="single" w:sz="4" w:space="0" w:color="A6A6A6"/>
+            </w:tcBorders>
+            <w:tcMar>
+              <w:top w:w="60" w:type="dxa"/>
+              <w:left w:w="90" w:type="dxa"/>
+              <w:bottom w:w="60" w:type="dxa"/>
+              <w:right w:w="90" w:type="dxa"/>
+            </w:tcMar>
+          </w:tcPr>
+          <w:p>
+            <w:r>
+              <w:rPr>
+                <w:sz w:val="19"/>
+                <w:szCs w:val="19"/>
+              </w:rPr>
+              <w:t xml:space="preserve">PR vers main</w:t>
+            </w:r>
+          </w:p>
+        </w:tc>
+        <w:tc>
+          <w:tcPr>
+            <w:tcW w:w="3800" w:type="dxa"/>
+            <w:tcBorders>
+              <w:top w:val="single" w:sz="4" w:space="0" w:color="A6A6A6"/>
+              <w:left w:val="single" w:sz="4" w:space="0" w:color="A6A6A6"/>
+              <w:bottom w:val="single" w:sz="4" w:space="0" w:color="A6A6A6"/>
+              <w:right w:val="single" w:sz="4" w:space="0" w:color="A6A6A6"/>
+            </w:tcBorders>
+            <w:tcMar>
+              <w:top w:w="60" w:type="dxa"/>
+              <w:left w:w="90" w:type="dxa"/>
+              <w:bottom w:w="60" w:type="dxa"/>
+              <w:right w:w="90" w:type="dxa"/>
+            </w:tcMar>
+          </w:tcPr>
+          <w:p>
+            <w:r>
+              <w:rPr>
+                <w:sz w:val="19"/>
+                <w:szCs w:val="19"/>
+              </w:rPr>
               <w:t xml:space="preserve">À faire</w:t>
             </w:r>
           </w:p>
@@ -9210,87 +10144,7 @@
                 <w:sz w:val="19"/>
                 <w:szCs w:val="19"/>
               </w:rPr>
-              <w:t xml:space="preserve">spec-kitty-docs-maintain, avant accept</w:t>
-            </w:r>
-          </w:p>
-        </w:tc>
-      </w:tr>
-      <w:tr>
-        <w:tc>
-          <w:tcPr>
-            <w:tcW w:w="2400" w:type="dxa"/>
-            <w:tcBorders>
-              <w:top w:val="single" w:sz="4" w:space="0" w:color="A6A6A6"/>
-              <w:left w:val="single" w:sz="4" w:space="0" w:color="A6A6A6"/>
-              <w:bottom w:val="single" w:sz="4" w:space="0" w:color="A6A6A6"/>
-              <w:right w:val="single" w:sz="4" w:space="0" w:color="A6A6A6"/>
-            </w:tcBorders>
-            <w:tcMar>
-              <w:top w:w="60" w:type="dxa"/>
-              <w:left w:w="90" w:type="dxa"/>
-              <w:bottom w:w="60" w:type="dxa"/>
-              <w:right w:w="90" w:type="dxa"/>
-            </w:tcMar>
-          </w:tcPr>
-          <w:p>
-            <w:r>
-              <w:rPr>
-                <w:sz w:val="19"/>
-                <w:szCs w:val="19"/>
-              </w:rPr>
-              <w:t xml:space="preserve">Accept, merge, revue post-fusion</w:t>
-            </w:r>
-          </w:p>
-        </w:tc>
-        <w:tc>
-          <w:tcPr>
-            <w:tcW w:w="3800" w:type="dxa"/>
-            <w:tcBorders>
-              <w:top w:val="single" w:sz="4" w:space="0" w:color="A6A6A6"/>
-              <w:left w:val="single" w:sz="4" w:space="0" w:color="A6A6A6"/>
-              <w:bottom w:val="single" w:sz="4" w:space="0" w:color="A6A6A6"/>
-              <w:right w:val="single" w:sz="4" w:space="0" w:color="A6A6A6"/>
-            </w:tcBorders>
-            <w:tcMar>
-              <w:top w:w="60" w:type="dxa"/>
-              <w:left w:w="90" w:type="dxa"/>
-              <w:bottom w:w="60" w:type="dxa"/>
-              <w:right w:w="90" w:type="dxa"/>
-            </w:tcMar>
-          </w:tcPr>
-          <w:p>
-            <w:r>
-              <w:rPr>
-                <w:sz w:val="19"/>
-                <w:szCs w:val="19"/>
-              </w:rPr>
-              <w:t xml:space="preserve">À faire</w:t>
-            </w:r>
-          </w:p>
-        </w:tc>
-        <w:tc>
-          <w:tcPr>
-            <w:tcW w:w="3438" w:type="dxa"/>
-            <w:tcBorders>
-              <w:top w:val="single" w:sz="4" w:space="0" w:color="A6A6A6"/>
-              <w:left w:val="single" w:sz="4" w:space="0" w:color="A6A6A6"/>
-              <w:bottom w:val="single" w:sz="4" w:space="0" w:color="A6A6A6"/>
-              <w:right w:val="single" w:sz="4" w:space="0" w:color="A6A6A6"/>
-            </w:tcBorders>
-            <w:tcMar>
-              <w:top w:w="60" w:type="dxa"/>
-              <w:left w:w="90" w:type="dxa"/>
-              <w:bottom w:w="60" w:type="dxa"/>
-              <w:right w:w="90" w:type="dxa"/>
-            </w:tcMar>
-          </w:tcPr>
-          <w:p>
-            <w:r>
-              <w:rPr>
-                <w:sz w:val="19"/>
-                <w:szCs w:val="19"/>
-              </w:rPr>
-              <w:t xml:space="preserve">Après WP14</w:t>
+              <w:t xml:space="preserve">Avec l’accord du porteur ; la CI confirme NFR-010</w:t>
             </w:r>
           </w:p>
         </w:tc>
@@ -9301,7 +10155,7 @@
         <w:spacing w:after="120"/>
       </w:pPr>
       <w:r>
-        <w:t xml:space="preserve">Prochaines étapes : rejouer et faire relire WP05 ; lancer WP07 (droits de la base, avec les reports de la relecture WP04) ; puis WP09 et WP10. La reprise d’une nouvelle session se fait depuis docs/passation-5b/REPRISE.md.</w:t>
+        <w:t xml:space="preserve">Prochaines étapes : ouvrir la PR vers main (CI = preuve de NFR-010, surveiller les mesures de latence de config.spec et heartbeat.spec) ; faire relire par une personne les fichiers listés en 7.4 ; traiter à la mission 7 les mineurs de test de WP14 (canari de payment-secrets, notes et refus admis des tests d’isolation, commentaire du test de written.replayed). Reprise : docs/passation-5b/REPRISE.md.</w:t>
       </w:r>
     </w:p>
     <w:sectPr>

</xml_diff>